<commit_message>
Illustrate and redesign project guides
</commit_message>
<xml_diff>
--- a/docs/guides/Delphi Web Studio Complete Workflow.docx
+++ b/docs/guides/Delphi Web Studio Complete Workflow.docx
@@ -2,6 +2,14 @@
 <file path=word/document.xml><?xml version="1.0" encoding="utf-8"?>
 <w:document xmlns:wpc="http://schemas.microsoft.com/office/word/2010/wordprocessingCanvas" xmlns:mo="http://schemas.microsoft.com/office/mac/office/2008/main" xmlns:mc="http://schemas.openxmlformats.org/markup-compatibility/2006" xmlns:mv="urn:schemas-microsoft-com:mac:vml" xmlns:o="urn:schemas-microsoft-com:office:office" xmlns:r="http://schemas.openxmlformats.org/officeDocument/2006/relationships" xmlns:m="http://schemas.openxmlformats.org/officeDocument/2006/math" xmlns:v="urn:schemas-microsoft-com:vml" xmlns:wp14="http://schemas.microsoft.com/office/word/2010/wordprocessingDrawing" xmlns:wp="http://schemas.openxmlformats.org/drawingml/2006/wordprocessingDrawing" xmlns:w10="urn:schemas-microsoft-com:office:word" xmlns:w="http://schemas.openxmlformats.org/wordprocessingml/2006/main" xmlns:w14="http://schemas.microsoft.com/office/word/2010/wordml" xmlns:wpg="http://schemas.microsoft.com/office/word/2010/wordprocessingGroup" xmlns:wpi="http://schemas.microsoft.com/office/word/2010/wordprocessingInk" xmlns:wne="http://schemas.microsoft.com/office/word/2006/wordml" xmlns:wps="http://schemas.microsoft.com/office/word/2010/wordprocessingShape" mc:Ignorable="w14 wp14">
   <w:body>
+    <w:p>
+      <w:r>
+        <w:rPr>
+          <w:color w:val="276495"/>
+        </w:rPr>
+        <w:t>DELPHI WEB STUDIO</w:t>
+      </w:r>
+    </w:p>
     <w:p>
       <w:pPr>
         <w:pStyle w:val="Title"/>
@@ -12,17 +20,64 @@
     </w:p>
     <w:p>
       <w:r>
-        <w:t>From opening the application to reviewing an exported website</w:t>
+        <w:t>A visual walkthrough from startup to website review</w:t>
       </w:r>
     </w:p>
     <w:p>
       <w:r>
-        <w:t>Last changed: November 1, 2026</w:t>
+        <w:t>Illustrated edition  |  Last changed: November 1, 2026</w:t>
       </w:r>
     </w:p>
     <w:p>
       <w:r>
-        <w:t>Experimental application | Windows 32 bit and 64 bit</w:t>
+        <w:t>Experimental Windows application</w:t>
+      </w:r>
+    </w:p>
+    <w:p>
+      <w:pPr>
+        <w:spacing w:before="500"/>
+      </w:pPr>
+      <w:r>
+        <w:drawing>
+          <wp:inline xmlns:a="http://schemas.openxmlformats.org/drawingml/2006/main" xmlns:pic="http://schemas.openxmlformats.org/drawingml/2006/picture">
+            <wp:extent cx="6080760" cy="1900238"/>
+            <wp:docPr id="1" name="Picture 1"/>
+            <wp:cNvGraphicFramePr>
+              <a:graphicFrameLocks noChangeAspect="1"/>
+            </wp:cNvGraphicFramePr>
+            <a:graphic>
+              <a:graphicData uri="http://schemas.openxmlformats.org/drawingml/2006/picture">
+                <pic:pic>
+                  <pic:nvPicPr>
+                    <pic:cNvPr id="0" name="project-flow.png"/>
+                    <pic:cNvPicPr/>
+                  </pic:nvPicPr>
+                  <pic:blipFill>
+                    <a:blip r:embed="rId9"/>
+                    <a:stretch>
+                      <a:fillRect/>
+                    </a:stretch>
+                  </pic:blipFill>
+                  <pic:spPr>
+                    <a:xfrm>
+                      <a:off x="0" y="0"/>
+                      <a:ext cx="6080760" cy="1900238"/>
+                    </a:xfrm>
+                    <a:prstGeom prst="rect"/>
+                  </pic:spPr>
+                </pic:pic>
+              </a:graphicData>
+            </a:graphic>
+          </wp:inline>
+        </w:drawing>
+      </w:r>
+    </w:p>
+    <w:p>
+      <w:pPr>
+        <w:pStyle w:val="Caption"/>
+      </w:pPr>
+      <w:r>
+        <w:t>Screens show an isolated example project. Your site content and available options may differ.</w:t>
       </w:r>
     </w:p>
     <w:p>
@@ -39,141 +94,240 @@
       </w:r>
     </w:p>
     <w:p>
+      <w:pPr>
+        <w:spacing w:after="0" w:line="220" w:lineRule="exact"/>
+      </w:pPr>
       <w:r>
         <w:fldChar w:fldCharType="begin"/>
       </w:r>
       <w:r>
-        <w:instrText xml:space="preserve"> TOC \o "1-2" \h \z \u </w:instrText>
+        <w:instrText xml:space="preserve"> TOC \o "1-1" \h \z \u </w:instrText>
       </w:r>
       <w:r>
         <w:fldChar w:fldCharType="separate"/>
       </w:r>
       <w:r>
+        <w:rPr>
+          <w:sz w:val="18"/>
+        </w:rPr>
         <w:t>Before you begin  3</w:t>
         <w:br/>
       </w:r>
       <w:r>
+        <w:rPr>
+          <w:sz w:val="18"/>
+        </w:rPr>
         <w:t>Open the program  3</w:t>
         <w:br/>
       </w:r>
       <w:r>
-        <w:t>Choose how to begin  3</w:t>
+        <w:rPr>
+          <w:sz w:val="18"/>
+        </w:rPr>
+        <w:t>Choose how to begin  4</w:t>
         <w:br/>
       </w:r>
       <w:r>
-        <w:t>Create a blank project or starter  3</w:t>
+        <w:rPr>
+          <w:sz w:val="18"/>
+        </w:rPr>
+        <w:t>Create a blank project or starter  4</w:t>
         <w:br/>
       </w:r>
       <w:r>
+        <w:rPr>
+          <w:sz w:val="18"/>
+        </w:rPr>
         <w:t>Open an existing project  4</w:t>
         <w:br/>
       </w:r>
       <w:r>
+        <w:rPr>
+          <w:sz w:val="18"/>
+        </w:rPr>
         <w:t>Understand the editor  4</w:t>
         <w:br/>
       </w:r>
       <w:r>
-        <w:t>Build and organize pages  4</w:t>
+        <w:rPr>
+          <w:sz w:val="18"/>
+        </w:rPr>
+        <w:t>Build and organize pages  5</w:t>
         <w:br/>
       </w:r>
       <w:r>
-        <w:t>Add, edit, reorder and remove sections  4</w:t>
+        <w:rPr>
+          <w:sz w:val="18"/>
+        </w:rPr>
+        <w:t>Add, edit, reorder and remove sections  6</w:t>
         <w:br/>
       </w:r>
       <w:r>
-        <w:t>Add images, documents and PDFs  5</w:t>
+        <w:rPr>
+          <w:sz w:val="18"/>
+        </w:rPr>
+        <w:t>Add images, documents and PDFs  7</w:t>
         <w:br/>
       </w:r>
       <w:r>
-        <w:t>Edit navigation and shared site information  5</w:t>
+        <w:rPr>
+          <w:sz w:val="18"/>
+        </w:rPr>
+        <w:t>Edit navigation and shared site information  8</w:t>
         <w:br/>
       </w:r>
       <w:r>
-        <w:t>Preview and check the site  5</w:t>
+        <w:rPr>
+          <w:sz w:val="18"/>
+        </w:rPr>
+        <w:t>Preview and check the site  8</w:t>
         <w:br/>
       </w:r>
       <w:r>
-        <w:t>Save and keep recovery copies  6</w:t>
+        <w:rPr>
+          <w:sz w:val="18"/>
+        </w:rPr>
+        <w:t>Save and keep recovery copies  9</w:t>
         <w:br/>
       </w:r>
       <w:r>
-        <w:t>Import an existing website  6</w:t>
+        <w:rPr>
+          <w:sz w:val="18"/>
+        </w:rPr>
+        <w:t>Import an existing website  10</w:t>
         <w:br/>
       </w:r>
       <w:r>
-        <w:t>Optional AI paths  6</w:t>
+        <w:rPr>
+          <w:sz w:val="18"/>
+        </w:rPr>
+        <w:t>Optional AI paths  10</w:t>
         <w:br/>
       </w:r>
       <w:r>
-        <w:t>Export and review without publishing  7</w:t>
+        <w:rPr>
+          <w:sz w:val="18"/>
+        </w:rPr>
+        <w:t>Export and review without publishing  10</w:t>
         <w:br/>
       </w:r>
       <w:r>
-        <w:t>Work with articles and drafts  7</w:t>
+        <w:rPr>
+          <w:sz w:val="18"/>
+        </w:rPr>
+        <w:t>Work with articles and drafts  11</w:t>
         <w:br/>
       </w:r>
       <w:r>
-        <w:t>Change appearance and screen visibility  7</w:t>
+        <w:rPr>
+          <w:sz w:val="18"/>
+        </w:rPr>
+        <w:t>Change appearance and screen visibility  11</w:t>
         <w:br/>
       </w:r>
       <w:r>
-        <w:t>Set links and preserve navigation  8</w:t>
+        <w:rPr>
+          <w:sz w:val="18"/>
+        </w:rPr>
+        <w:t>Set links and preserve navigation  12</w:t>
         <w:br/>
       </w:r>
       <w:r>
-        <w:t>Use local AI deliberately  8</w:t>
+        <w:rPr>
+          <w:sz w:val="18"/>
+        </w:rPr>
+        <w:t>Use local AI deliberately  12</w:t>
         <w:br/>
       </w:r>
       <w:r>
-        <w:t>Use the code panel carefully  8</w:t>
+        <w:rPr>
+          <w:sz w:val="18"/>
+        </w:rPr>
+        <w:t>Use the code panel carefully  13</w:t>
         <w:br/>
       </w:r>
       <w:r>
-        <w:t>Understand the desktop menus and status line  9</w:t>
+        <w:rPr>
+          <w:sz w:val="18"/>
+        </w:rPr>
+        <w:t>Understand the desktop menus and status line  14</w:t>
         <w:br/>
       </w:r>
       <w:r>
-        <w:t>Privacy and optional online content  9</w:t>
+        <w:rPr>
+          <w:sz w:val="18"/>
+        </w:rPr>
+        <w:t>Privacy and optional online content  14</w:t>
         <w:br/>
       </w:r>
       <w:r>
-        <w:t>Worked example A small community website  9</w:t>
+        <w:rPr>
+          <w:sz w:val="18"/>
+        </w:rPr>
+        <w:t>Worked example A small community website  14</w:t>
         <w:br/>
       </w:r>
       <w:r>
-        <w:t>Component reference Common page sections  10</w:t>
+        <w:rPr>
+          <w:sz w:val="18"/>
+        </w:rPr>
+        <w:t>Component reference Common page sections  15</w:t>
         <w:br/>
       </w:r>
       <w:r>
-        <w:t>Troubleshooting common workflow problems  11</w:t>
+        <w:rPr>
+          <w:sz w:val="18"/>
+        </w:rPr>
+        <w:t>Troubleshooting common workflow problems  16</w:t>
         <w:br/>
       </w:r>
       <w:r>
-        <w:t>Review the SFTP tools without publishing  12</w:t>
+        <w:rPr>
+          <w:sz w:val="18"/>
+        </w:rPr>
+        <w:t>Review the SFTP tools without publishing  17</w:t>
         <w:br/>
       </w:r>
       <w:r>
-        <w:t>Find your way around the dashboard  12</w:t>
+        <w:rPr>
+          <w:sz w:val="18"/>
+        </w:rPr>
+        <w:t>Find your way around the dashboard  17</w:t>
         <w:br/>
       </w:r>
       <w:r>
-        <w:t>Select and configure a PDF viewer  12</w:t>
+        <w:rPr>
+          <w:sz w:val="18"/>
+        </w:rPr>
+        <w:t>Select and configure a PDF viewer  18</w:t>
         <w:br/>
       </w:r>
       <w:r>
-        <w:t>Set up a contact destination  13</w:t>
+        <w:rPr>
+          <w:sz w:val="18"/>
+        </w:rPr>
+        <w:t>Set up a contact destination  18</w:t>
         <w:br/>
       </w:r>
       <w:r>
-        <w:t>Understand the generated website and the editable project  13</w:t>
+        <w:rPr>
+          <w:sz w:val="18"/>
+        </w:rPr>
+        <w:t>Understand the generated website and the editable project  18</w:t>
         <w:br/>
       </w:r>
       <w:r>
-        <w:t>Finish and resume later  13</w:t>
+        <w:rPr>
+          <w:sz w:val="18"/>
+        </w:rPr>
+        <w:t>Finish and resume later  19</w:t>
         <w:br/>
       </w:r>
       <w:r>
-        <w:t>Evidence and limitations  13</w:t>
+        <w:rPr>
+          <w:sz w:val="18"/>
+        </w:rPr>
+        <w:t>Evidence and limitations  19</w:t>
         <w:br/>
       </w:r>
       <w:r>
@@ -199,6 +353,60 @@
       </w:r>
     </w:p>
     <w:p>
+      <w:pPr>
+        <w:keepNext/>
+        <w:spacing w:before="100" w:after="60"/>
+        <w:jc w:val="center"/>
+      </w:pPr>
+      <w:r>
+        <w:drawing>
+          <wp:inline xmlns:a="http://schemas.openxmlformats.org/drawingml/2006/main" xmlns:pic="http://schemas.openxmlformats.org/drawingml/2006/picture">
+            <wp:extent cx="6126480" cy="1914525"/>
+            <wp:docPr id="2" name="Picture 2" descr="The four stages from creating a project to a deliberate hosting decision."/>
+            <wp:cNvGraphicFramePr>
+              <a:graphicFrameLocks noChangeAspect="1"/>
+            </wp:cNvGraphicFramePr>
+            <a:graphic>
+              <a:graphicData uri="http://schemas.openxmlformats.org/drawingml/2006/picture">
+                <pic:pic>
+                  <pic:nvPicPr>
+                    <pic:cNvPr id="0" name="project-flow.png"/>
+                    <pic:cNvPicPr/>
+                  </pic:nvPicPr>
+                  <pic:blipFill>
+                    <a:blip r:embed="rId9"/>
+                    <a:stretch>
+                      <a:fillRect/>
+                    </a:stretch>
+                  </pic:blipFill>
+                  <pic:spPr>
+                    <a:xfrm>
+                      <a:off x="0" y="0"/>
+                      <a:ext cx="6126480" cy="1914525"/>
+                    </a:xfrm>
+                    <a:prstGeom prst="rect"/>
+                  </pic:spPr>
+                </pic:pic>
+              </a:graphicData>
+            </a:graphic>
+          </wp:inline>
+        </w:drawing>
+      </w:r>
+    </w:p>
+    <w:p>
+      <w:pPr>
+        <w:pStyle w:val="Caption"/>
+        <w:spacing w:after="200"/>
+      </w:pPr>
+      <w:r>
+        <w:rPr>
+          <w:color w:val="495F73"/>
+          <w:sz w:val="18"/>
+        </w:rPr>
+        <w:t>Figure 1. The four stages from creating a project to a deliberate hosting decision.</w:t>
+      </w:r>
+    </w:p>
+    <w:p>
       <w:r>
         <w:t>Use the Win64 build on a 64-bit Windows computer and the Win32 build where a 32-bit executable is needed. Keep the editor folder and WebView2Loader.dll beside the executable. Microsoft Edge WebView2 Runtime must be installed. A project is your editable work; an exported website is a separate set of files intended for a web server. Keep both a project file and independent backups.</w:t>
       </w:r>
@@ -217,6 +425,60 @@
       </w:pPr>
       <w:r>
         <w:t>Open the desired Win64 or Win32 folder and double-click DelphiWebStudio.exe. The application opens maximized. Wait for the local editor to appear.</w:t>
+      </w:r>
+    </w:p>
+    <w:p>
+      <w:pPr>
+        <w:keepNext/>
+        <w:spacing w:before="100" w:after="60"/>
+        <w:jc w:val="center"/>
+      </w:pPr>
+      <w:r>
+        <w:drawing>
+          <wp:inline xmlns:a="http://schemas.openxmlformats.org/drawingml/2006/main" xmlns:pic="http://schemas.openxmlformats.org/drawingml/2006/picture">
+            <wp:extent cx="6126480" cy="3262351"/>
+            <wp:docPr id="3" name="Picture 3" descr="Dashboard: 1 Open project, 2 starter cards, 3 start blank."/>
+            <wp:cNvGraphicFramePr>
+              <a:graphicFrameLocks noChangeAspect="1"/>
+            </wp:cNvGraphicFramePr>
+            <a:graphic>
+              <a:graphicData uri="http://schemas.openxmlformats.org/drawingml/2006/picture">
+                <pic:pic>
+                  <pic:nvPicPr>
+                    <pic:cNvPr id="0" name="dashboard.png"/>
+                    <pic:cNvPicPr/>
+                  </pic:nvPicPr>
+                  <pic:blipFill>
+                    <a:blip r:embed="rId10"/>
+                    <a:stretch>
+                      <a:fillRect/>
+                    </a:stretch>
+                  </pic:blipFill>
+                  <pic:spPr>
+                    <a:xfrm>
+                      <a:off x="0" y="0"/>
+                      <a:ext cx="6126480" cy="3262351"/>
+                    </a:xfrm>
+                    <a:prstGeom prst="rect"/>
+                  </pic:spPr>
+                </pic:pic>
+              </a:graphicData>
+            </a:graphic>
+          </wp:inline>
+        </w:drawing>
+      </w:r>
+    </w:p>
+    <w:p>
+      <w:pPr>
+        <w:pStyle w:val="Caption"/>
+        <w:spacing w:after="200"/>
+      </w:pPr>
+      <w:r>
+        <w:rPr>
+          <w:color w:val="495F73"/>
+          <w:sz w:val="18"/>
+        </w:rPr>
+        <w:t>Figure 2. Dashboard: 1 Open project, 2 starter cards, 3 start blank.</w:t>
       </w:r>
     </w:p>
     <w:p>
@@ -334,6 +596,60 @@
       </w:r>
     </w:p>
     <w:p>
+      <w:pPr>
+        <w:keepNext/>
+        <w:spacing w:before="100" w:after="60"/>
+        <w:jc w:val="center"/>
+      </w:pPr>
+      <w:r>
+        <w:drawing>
+          <wp:inline xmlns:a="http://schemas.openxmlformats.org/drawingml/2006/main" xmlns:pic="http://schemas.openxmlformats.org/drawingml/2006/picture">
+            <wp:extent cx="6126480" cy="3262351"/>
+            <wp:docPr id="4" name="Picture 4" descr="Editor: 1 Components, 2 page tabs, 3 canvas, 4 Properties, 5 Save project, 6 Export."/>
+            <wp:cNvGraphicFramePr>
+              <a:graphicFrameLocks noChangeAspect="1"/>
+            </wp:cNvGraphicFramePr>
+            <a:graphic>
+              <a:graphicData uri="http://schemas.openxmlformats.org/drawingml/2006/picture">
+                <pic:pic>
+                  <pic:nvPicPr>
+                    <pic:cNvPr id="0" name="editor.png"/>
+                    <pic:cNvPicPr/>
+                  </pic:nvPicPr>
+                  <pic:blipFill>
+                    <a:blip r:embed="rId11"/>
+                    <a:stretch>
+                      <a:fillRect/>
+                    </a:stretch>
+                  </pic:blipFill>
+                  <pic:spPr>
+                    <a:xfrm>
+                      <a:off x="0" y="0"/>
+                      <a:ext cx="6126480" cy="3262351"/>
+                    </a:xfrm>
+                    <a:prstGeom prst="rect"/>
+                  </pic:spPr>
+                </pic:pic>
+              </a:graphicData>
+            </a:graphic>
+          </wp:inline>
+        </w:drawing>
+      </w:r>
+    </w:p>
+    <w:p>
+      <w:pPr>
+        <w:pStyle w:val="Caption"/>
+        <w:spacing w:after="200"/>
+      </w:pPr>
+      <w:r>
+        <w:rPr>
+          <w:color w:val="495F73"/>
+          <w:sz w:val="18"/>
+        </w:rPr>
+        <w:t>Figure 3. Editor: 1 Components, 2 page tabs, 3 canvas, 4 Properties, 5 Save project, 6 Export.</w:t>
+      </w:r>
+    </w:p>
+    <w:p>
       <w:r>
         <w:t>Beginner, Designer and Professional are different starting arrangements for the same project. Professional opens the JSON view; it is not a full direct editor for all generated HTML. The application can also store additive page-specific custom code, but desktop custom-code preview is limited. Use trusted code and test the exported result.</w:t>
       </w:r>
@@ -356,6 +672,60 @@
     </w:p>
     <w:p>
       <w:pPr>
+        <w:keepNext/>
+        <w:spacing w:before="100" w:after="60"/>
+        <w:jc w:val="center"/>
+      </w:pPr>
+      <w:r>
+        <w:drawing>
+          <wp:inline xmlns:a="http://schemas.openxmlformats.org/drawingml/2006/main" xmlns:pic="http://schemas.openxmlformats.org/drawingml/2006/picture">
+            <wp:extent cx="3200400" cy="2548467"/>
+            <wp:docPr id="5" name="Picture 5" descr="Add page: 1 page name, 2 path, 3 Add Page. The example shows placeholders."/>
+            <wp:cNvGraphicFramePr>
+              <a:graphicFrameLocks noChangeAspect="1"/>
+            </wp:cNvGraphicFramePr>
+            <a:graphic>
+              <a:graphicData uri="http://schemas.openxmlformats.org/drawingml/2006/picture">
+                <pic:pic>
+                  <pic:nvPicPr>
+                    <pic:cNvPr id="0" name="add-page-detail.png"/>
+                    <pic:cNvPicPr/>
+                  </pic:nvPicPr>
+                  <pic:blipFill>
+                    <a:blip r:embed="rId12"/>
+                    <a:stretch>
+                      <a:fillRect/>
+                    </a:stretch>
+                  </pic:blipFill>
+                  <pic:spPr>
+                    <a:xfrm>
+                      <a:off x="0" y="0"/>
+                      <a:ext cx="3200400" cy="2548467"/>
+                    </a:xfrm>
+                    <a:prstGeom prst="rect"/>
+                  </pic:spPr>
+                </pic:pic>
+              </a:graphicData>
+            </a:graphic>
+          </wp:inline>
+        </w:drawing>
+      </w:r>
+    </w:p>
+    <w:p>
+      <w:pPr>
+        <w:pStyle w:val="Caption"/>
+        <w:spacing w:after="200"/>
+      </w:pPr>
+      <w:r>
+        <w:rPr>
+          <w:color w:val="495F73"/>
+          <w:sz w:val="18"/>
+        </w:rPr>
+        <w:t>Figure 4. Add page: 1 page name, 2 path, 3 Add Page. The example shows placeholders.</w:t>
+      </w:r>
+    </w:p>
+    <w:p>
+      <w:pPr>
         <w:pStyle w:val="ListNumber"/>
       </w:pPr>
       <w:r>
@@ -404,6 +774,60 @@
     </w:p>
     <w:p>
       <w:pPr>
+        <w:keepNext/>
+        <w:spacing w:before="100" w:after="60"/>
+        <w:jc w:val="center"/>
+      </w:pPr>
+      <w:r>
+        <w:drawing>
+          <wp:inline xmlns:a="http://schemas.openxmlformats.org/drawingml/2006/main" xmlns:pic="http://schemas.openxmlformats.org/drawingml/2006/picture">
+            <wp:extent cx="3200400" cy="5183038"/>
+            <wp:docPr id="6" name="Picture 6" descr="A selected Hero exposes its editable fields in Properties."/>
+            <wp:cNvGraphicFramePr>
+              <a:graphicFrameLocks noChangeAspect="1"/>
+            </wp:cNvGraphicFramePr>
+            <a:graphic>
+              <a:graphicData uri="http://schemas.openxmlformats.org/drawingml/2006/picture">
+                <pic:pic>
+                  <pic:nvPicPr>
+                    <pic:cNvPr id="0" name="properties-detail.png"/>
+                    <pic:cNvPicPr/>
+                  </pic:nvPicPr>
+                  <pic:blipFill>
+                    <a:blip r:embed="rId13"/>
+                    <a:stretch>
+                      <a:fillRect/>
+                    </a:stretch>
+                  </pic:blipFill>
+                  <pic:spPr>
+                    <a:xfrm>
+                      <a:off x="0" y="0"/>
+                      <a:ext cx="3200400" cy="5183038"/>
+                    </a:xfrm>
+                    <a:prstGeom prst="rect"/>
+                  </pic:spPr>
+                </pic:pic>
+              </a:graphicData>
+            </a:graphic>
+          </wp:inline>
+        </w:drawing>
+      </w:r>
+    </w:p>
+    <w:p>
+      <w:pPr>
+        <w:pStyle w:val="Caption"/>
+        <w:spacing w:after="200"/>
+      </w:pPr>
+      <w:r>
+        <w:rPr>
+          <w:color w:val="495F73"/>
+          <w:sz w:val="18"/>
+        </w:rPr>
+        <w:t>Figure 5. A selected Hero exposes its editable fields in Properties.</w:t>
+      </w:r>
+    </w:p>
+    <w:p>
+      <w:pPr>
         <w:pStyle w:val="ListNumber"/>
       </w:pPr>
       <w:r>
@@ -448,6 +872,60 @@
       </w:pPr>
       <w:r>
         <w:t>Open Media and import individual files or folders, or drop them from Explorer. Select the duplicate policy: reuse an existing matching item, keep a separate copy, or skip the duplicate. The app reports rejected files; source files are not modified.</w:t>
+      </w:r>
+    </w:p>
+    <w:p>
+      <w:pPr>
+        <w:keepNext/>
+        <w:spacing w:before="100" w:after="60"/>
+        <w:jc w:val="center"/>
+      </w:pPr>
+      <w:r>
+        <w:drawing>
+          <wp:inline xmlns:a="http://schemas.openxmlformats.org/drawingml/2006/main" xmlns:pic="http://schemas.openxmlformats.org/drawingml/2006/picture">
+            <wp:extent cx="3291840" cy="3909060"/>
+            <wp:docPr id="7" name="Picture 7" descr="The Media panel provides duplicate handling, file and folder import, and search."/>
+            <wp:cNvGraphicFramePr>
+              <a:graphicFrameLocks noChangeAspect="1"/>
+            </wp:cNvGraphicFramePr>
+            <a:graphic>
+              <a:graphicData uri="http://schemas.openxmlformats.org/drawingml/2006/picture">
+                <pic:pic>
+                  <pic:nvPicPr>
+                    <pic:cNvPr id="0" name="media-detail.png"/>
+                    <pic:cNvPicPr/>
+                  </pic:nvPicPr>
+                  <pic:blipFill>
+                    <a:blip r:embed="rId14"/>
+                    <a:stretch>
+                      <a:fillRect/>
+                    </a:stretch>
+                  </pic:blipFill>
+                  <pic:spPr>
+                    <a:xfrm>
+                      <a:off x="0" y="0"/>
+                      <a:ext cx="3291840" cy="3909060"/>
+                    </a:xfrm>
+                    <a:prstGeom prst="rect"/>
+                  </pic:spPr>
+                </pic:pic>
+              </a:graphicData>
+            </a:graphic>
+          </wp:inline>
+        </w:drawing>
+      </w:r>
+    </w:p>
+    <w:p>
+      <w:pPr>
+        <w:pStyle w:val="Caption"/>
+        <w:spacing w:after="200"/>
+      </w:pPr>
+      <w:r>
+        <w:rPr>
+          <w:color w:val="495F73"/>
+          <w:sz w:val="18"/>
+        </w:rPr>
+        <w:t>Figure 6. The Media panel provides duplicate handling, file and folder import, and search.</w:t>
       </w:r>
     </w:p>
     <w:p>
@@ -497,6 +975,60 @@
     </w:p>
     <w:p>
       <w:pPr>
+        <w:keepNext/>
+        <w:spacing w:before="100" w:after="60"/>
+        <w:jc w:val="center"/>
+      </w:pPr>
+      <w:r>
+        <w:drawing>
+          <wp:inline xmlns:a="http://schemas.openxmlformats.org/drawingml/2006/main" xmlns:pic="http://schemas.openxmlformats.org/drawingml/2006/picture">
+            <wp:extent cx="4754880" cy="3354832"/>
+            <wp:docPr id="8" name="Picture 8" descr="General settings for the site name, description, search and language."/>
+            <wp:cNvGraphicFramePr>
+              <a:graphicFrameLocks noChangeAspect="1"/>
+            </wp:cNvGraphicFramePr>
+            <a:graphic>
+              <a:graphicData uri="http://schemas.openxmlformats.org/drawingml/2006/picture">
+                <pic:pic>
+                  <pic:nvPicPr>
+                    <pic:cNvPr id="0" name="settings-detail.png"/>
+                    <pic:cNvPicPr/>
+                  </pic:nvPicPr>
+                  <pic:blipFill>
+                    <a:blip r:embed="rId15"/>
+                    <a:stretch>
+                      <a:fillRect/>
+                    </a:stretch>
+                  </pic:blipFill>
+                  <pic:spPr>
+                    <a:xfrm>
+                      <a:off x="0" y="0"/>
+                      <a:ext cx="4754880" cy="3354832"/>
+                    </a:xfrm>
+                    <a:prstGeom prst="rect"/>
+                  </pic:spPr>
+                </pic:pic>
+              </a:graphicData>
+            </a:graphic>
+          </wp:inline>
+        </w:drawing>
+      </w:r>
+    </w:p>
+    <w:p>
+      <w:pPr>
+        <w:pStyle w:val="Caption"/>
+        <w:spacing w:after="200"/>
+      </w:pPr>
+      <w:r>
+        <w:rPr>
+          <w:color w:val="495F73"/>
+          <w:sz w:val="18"/>
+        </w:rPr>
+        <w:t>Figure 7. General settings for the site name, description, search and language.</w:t>
+      </w:r>
+    </w:p>
+    <w:p>
+      <w:pPr>
         <w:pStyle w:val="Heading1"/>
       </w:pPr>
       <w:r>
@@ -513,6 +1045,60 @@
     </w:p>
     <w:p>
       <w:pPr>
+        <w:keepNext/>
+        <w:spacing w:before="100" w:after="60"/>
+        <w:jc w:val="center"/>
+      </w:pPr>
+      <w:r>
+        <w:drawing>
+          <wp:inline xmlns:a="http://schemas.openxmlformats.org/drawingml/2006/main" xmlns:pic="http://schemas.openxmlformats.org/drawingml/2006/picture">
+            <wp:extent cx="5303520" cy="2956061"/>
+            <wp:docPr id="9" name="Picture 9" descr="Check site reports selected issues and states the limits of its checks."/>
+            <wp:cNvGraphicFramePr>
+              <a:graphicFrameLocks noChangeAspect="1"/>
+            </wp:cNvGraphicFramePr>
+            <a:graphic>
+              <a:graphicData uri="http://schemas.openxmlformats.org/drawingml/2006/picture">
+                <pic:pic>
+                  <pic:nvPicPr>
+                    <pic:cNvPr id="0" name="check-site-detail.png"/>
+                    <pic:cNvPicPr/>
+                  </pic:nvPicPr>
+                  <pic:blipFill>
+                    <a:blip r:embed="rId16"/>
+                    <a:stretch>
+                      <a:fillRect/>
+                    </a:stretch>
+                  </pic:blipFill>
+                  <pic:spPr>
+                    <a:xfrm>
+                      <a:off x="0" y="0"/>
+                      <a:ext cx="5303520" cy="2956061"/>
+                    </a:xfrm>
+                    <a:prstGeom prst="rect"/>
+                  </pic:spPr>
+                </pic:pic>
+              </a:graphicData>
+            </a:graphic>
+          </wp:inline>
+        </w:drawing>
+      </w:r>
+    </w:p>
+    <w:p>
+      <w:pPr>
+        <w:pStyle w:val="Caption"/>
+        <w:spacing w:after="200"/>
+      </w:pPr>
+      <w:r>
+        <w:rPr>
+          <w:color w:val="495F73"/>
+          <w:sz w:val="18"/>
+        </w:rPr>
+        <w:t>Figure 8. Check site reports selected issues and states the limits of its checks.</w:t>
+      </w:r>
+    </w:p>
+    <w:p>
+      <w:pPr>
         <w:pStyle w:val="ListNumber"/>
       </w:pPr>
       <w:r>
@@ -549,6 +1135,60 @@
       </w:pPr>
       <w:r>
         <w:t>Choose Save project, select a folder and filename, and wait for completion. Projects without media can be JSON; projects with media use a ZIP containing the manifest and media. Do not confuse this project ZIP with the exported website ZIP.</w:t>
+      </w:r>
+    </w:p>
+    <w:p>
+      <w:pPr>
+        <w:keepNext/>
+        <w:spacing w:before="100" w:after="60"/>
+        <w:jc w:val="center"/>
+      </w:pPr>
+      <w:r>
+        <w:drawing>
+          <wp:inline xmlns:a="http://schemas.openxmlformats.org/drawingml/2006/main" xmlns:pic="http://schemas.openxmlformats.org/drawingml/2006/picture">
+            <wp:extent cx="6126480" cy="1914525"/>
+            <wp:docPr id="10" name="Picture 10" descr="A project save and a separately verified backup are distinct steps."/>
+            <wp:cNvGraphicFramePr>
+              <a:graphicFrameLocks noChangeAspect="1"/>
+            </wp:cNvGraphicFramePr>
+            <a:graphic>
+              <a:graphicData uri="http://schemas.openxmlformats.org/drawingml/2006/picture">
+                <pic:pic>
+                  <pic:nvPicPr>
+                    <pic:cNvPr id="0" name="save-flow.png"/>
+                    <pic:cNvPicPr/>
+                  </pic:nvPicPr>
+                  <pic:blipFill>
+                    <a:blip r:embed="rId17"/>
+                    <a:stretch>
+                      <a:fillRect/>
+                    </a:stretch>
+                  </pic:blipFill>
+                  <pic:spPr>
+                    <a:xfrm>
+                      <a:off x="0" y="0"/>
+                      <a:ext cx="6126480" cy="1914525"/>
+                    </a:xfrm>
+                    <a:prstGeom prst="rect"/>
+                  </pic:spPr>
+                </pic:pic>
+              </a:graphicData>
+            </a:graphic>
+          </wp:inline>
+        </w:drawing>
+      </w:r>
+    </w:p>
+    <w:p>
+      <w:pPr>
+        <w:pStyle w:val="Caption"/>
+        <w:spacing w:after="200"/>
+      </w:pPr>
+      <w:r>
+        <w:rPr>
+          <w:color w:val="495F73"/>
+          <w:sz w:val="18"/>
+        </w:rPr>
+        <w:t>Figure 9. A project save and a separately verified backup are distinct steps.</w:t>
       </w:r>
     </w:p>
     <w:p>
@@ -637,6 +1277,60 @@
     </w:p>
     <w:p>
       <w:pPr>
+        <w:keepNext/>
+        <w:spacing w:before="100" w:after="60"/>
+        <w:jc w:val="center"/>
+      </w:pPr>
+      <w:r>
+        <w:drawing>
+          <wp:inline xmlns:a="http://schemas.openxmlformats.org/drawingml/2006/main" xmlns:pic="http://schemas.openxmlformats.org/drawingml/2006/picture">
+            <wp:extent cx="6126480" cy="2011680"/>
+            <wp:docPr id="11" name="Picture 11" descr="Review website files builds a local list and does not publish the site."/>
+            <wp:cNvGraphicFramePr>
+              <a:graphicFrameLocks noChangeAspect="1"/>
+            </wp:cNvGraphicFramePr>
+            <a:graphic>
+              <a:graphicData uri="http://schemas.openxmlformats.org/drawingml/2006/picture">
+                <pic:pic>
+                  <pic:nvPicPr>
+                    <pic:cNvPr id="0" name="review-detail.png"/>
+                    <pic:cNvPicPr/>
+                  </pic:nvPicPr>
+                  <pic:blipFill>
+                    <a:blip r:embed="rId18"/>
+                    <a:stretch>
+                      <a:fillRect/>
+                    </a:stretch>
+                  </pic:blipFill>
+                  <pic:spPr>
+                    <a:xfrm>
+                      <a:off x="0" y="0"/>
+                      <a:ext cx="6126480" cy="2011680"/>
+                    </a:xfrm>
+                    <a:prstGeom prst="rect"/>
+                  </pic:spPr>
+                </pic:pic>
+              </a:graphicData>
+            </a:graphic>
+          </wp:inline>
+        </w:drawing>
+      </w:r>
+    </w:p>
+    <w:p>
+      <w:pPr>
+        <w:pStyle w:val="Caption"/>
+        <w:spacing w:after="200"/>
+      </w:pPr>
+      <w:r>
+        <w:rPr>
+          <w:color w:val="495F73"/>
+          <w:sz w:val="18"/>
+        </w:rPr>
+        <w:t>Figure 10. Review website files builds a local list and does not publish the site.</w:t>
+      </w:r>
+    </w:p>
+    <w:p>
+      <w:pPr>
         <w:pStyle w:val="ListNumber"/>
       </w:pPr>
       <w:r>
@@ -785,6 +1479,60 @@
       </w:pPr>
       <w:r>
         <w:t>Open a project and choose Local AI from the Windows menu. Use Browse to select the supported llama.cpp b12012 Windows x64 CPU runtime ZIP and a supported GGUF model file. The buttons open download links in your browser; afterwards, select the downloaded files with Browse. The runtime and models are not included automatically with the editor. The offered runtime is x64, so it requires a 64-bit Windows system even when using the Win32 editor. Five-page planning requires a blank project; the other offered actions work on existing projects.</w:t>
+      </w:r>
+    </w:p>
+    <w:p>
+      <w:pPr>
+        <w:keepNext/>
+        <w:spacing w:before="100" w:after="60"/>
+        <w:jc w:val="center"/>
+      </w:pPr>
+      <w:r>
+        <w:drawing>
+          <wp:inline xmlns:a="http://schemas.openxmlformats.org/drawingml/2006/main" xmlns:pic="http://schemas.openxmlformats.org/drawingml/2006/picture">
+            <wp:extent cx="5303520" cy="4027759"/>
+            <wp:docPr id="12" name="Picture 12" descr="The optional local AI dialog selects a runtime ZIP, model and proposal type."/>
+            <wp:cNvGraphicFramePr>
+              <a:graphicFrameLocks noChangeAspect="1"/>
+            </wp:cNvGraphicFramePr>
+            <a:graphic>
+              <a:graphicData uri="http://schemas.openxmlformats.org/drawingml/2006/picture">
+                <pic:pic>
+                  <pic:nvPicPr>
+                    <pic:cNvPr id="0" name="local-ai.png"/>
+                    <pic:cNvPicPr/>
+                  </pic:nvPicPr>
+                  <pic:blipFill>
+                    <a:blip r:embed="rId19"/>
+                    <a:stretch>
+                      <a:fillRect/>
+                    </a:stretch>
+                  </pic:blipFill>
+                  <pic:spPr>
+                    <a:xfrm>
+                      <a:off x="0" y="0"/>
+                      <a:ext cx="5303520" cy="4027759"/>
+                    </a:xfrm>
+                    <a:prstGeom prst="rect"/>
+                  </pic:spPr>
+                </pic:pic>
+              </a:graphicData>
+            </a:graphic>
+          </wp:inline>
+        </w:drawing>
+      </w:r>
+    </w:p>
+    <w:p>
+      <w:pPr>
+        <w:pStyle w:val="Caption"/>
+        <w:spacing w:after="200"/>
+      </w:pPr>
+      <w:r>
+        <w:rPr>
+          <w:color w:val="495F73"/>
+          <w:sz w:val="18"/>
+        </w:rPr>
+        <w:t>Figure 11. The optional local AI dialog selects a runtime ZIP, model and proposal type.</w:t>
       </w:r>
     </w:p>
     <w:p>
@@ -1110,6 +1858,60 @@
       </w:r>
     </w:p>
     <w:p>
+      <w:pPr>
+        <w:keepNext/>
+        <w:spacing w:before="100" w:after="60"/>
+        <w:jc w:val="center"/>
+      </w:pPr>
+      <w:r>
+        <w:drawing>
+          <wp:inline xmlns:a="http://schemas.openxmlformats.org/drawingml/2006/main" xmlns:pic="http://schemas.openxmlformats.org/drawingml/2006/picture">
+            <wp:extent cx="5669280" cy="4320319"/>
+            <wp:docPr id="13" name="Picture 13" descr="The SFTP dialog separates connection, scan, backup and review actions."/>
+            <wp:cNvGraphicFramePr>
+              <a:graphicFrameLocks noChangeAspect="1"/>
+            </wp:cNvGraphicFramePr>
+            <a:graphic>
+              <a:graphicData uri="http://schemas.openxmlformats.org/drawingml/2006/picture">
+                <pic:pic>
+                  <pic:nvPicPr>
+                    <pic:cNvPr id="0" name="sftp.png"/>
+                    <pic:cNvPicPr/>
+                  </pic:nvPicPr>
+                  <pic:blipFill>
+                    <a:blip r:embed="rId20"/>
+                    <a:stretch>
+                      <a:fillRect/>
+                    </a:stretch>
+                  </pic:blipFill>
+                  <pic:spPr>
+                    <a:xfrm>
+                      <a:off x="0" y="0"/>
+                      <a:ext cx="5669280" cy="4320319"/>
+                    </a:xfrm>
+                    <a:prstGeom prst="rect"/>
+                  </pic:spPr>
+                </pic:pic>
+              </a:graphicData>
+            </a:graphic>
+          </wp:inline>
+        </w:drawing>
+      </w:r>
+    </w:p>
+    <w:p>
+      <w:pPr>
+        <w:pStyle w:val="Caption"/>
+        <w:spacing w:after="200"/>
+      </w:pPr>
+      <w:r>
+        <w:rPr>
+          <w:color w:val="495F73"/>
+          <w:sz w:val="18"/>
+        </w:rPr>
+        <w:t>Figure 12. The SFTP dialog separates connection, scan, backup and review actions.</w:t>
+      </w:r>
+    </w:p>
+    <w:p>
       <w:r>
         <w:t>Review website opens a separate review window where you can select the website ZIP, destination scan, backup ZIP and other recovery information. Review files compares local inputs; Check destination checks the entered destination separately. The Publish button is a further deliberate step that asks for confirmation. Do not use it until you actually intend to upload. A failed or interrupted transfer can leave partial changes; keep and inspect the receipt and recovery materials.</w:t>
       </w:r>
@@ -1228,9 +2030,10 @@
       </w:r>
     </w:p>
     <w:sectPr>
-      <w:footerReference w:type="default" r:id="rId9"/>
+      <w:headerReference w:type="default" r:id="rId21"/>
+      <w:footerReference w:type="default" r:id="rId22"/>
       <w:pgSz w:w="12240" w:h="15840"/>
-      <w:pgMar w:top="1152" w:right="1224" w:bottom="1152" w:left="1224" w:header="720" w:footer="720" w:gutter="0"/>
+      <w:pgMar w:top="1037" w:right="1181" w:bottom="1037" w:left="1181" w:header="720" w:footer="720" w:gutter="0"/>
       <w:cols w:space="720"/>
       <w:docGrid w:linePitch="360"/>
     </w:sectPr>
@@ -1246,11 +2049,27 @@
       <w:jc w:val="right"/>
     </w:pPr>
     <w:r>
-      <w:t xml:space="preserve">Delphi Web Studio  |  </w:t>
+      <w:t xml:space="preserve">Illustrated Complete Workflow  |  </w:t>
     </w:r>
     <w:fldSimple w:instr="PAGE"/>
   </w:p>
 </w:ftr>
+</file>
+
+<file path=word/header1.xml><?xml version="1.0" encoding="utf-8"?>
+<w:hdr xmlns:m="http://schemas.openxmlformats.org/officeDocument/2006/math" xmlns:mc="http://schemas.openxmlformats.org/markup-compatibility/2006" xmlns:mo="http://schemas.microsoft.com/office/mac/office/2008/main" xmlns:mv="urn:schemas-microsoft-com:mac:vml" xmlns:o="urn:schemas-microsoft-com:office:office" xmlns:r="http://schemas.openxmlformats.org/officeDocument/2006/relationships" xmlns:v="urn:schemas-microsoft-com:vml" xmlns:w10="urn:schemas-microsoft-com:office:word" xmlns:w14="http://schemas.microsoft.com/office/word/2010/wordml" xmlns:w="http://schemas.openxmlformats.org/wordprocessingml/2006/main" xmlns:wne="http://schemas.microsoft.com/office/word/2006/wordml" xmlns:wp14="http://schemas.microsoft.com/office/word/2010/wordprocessingDrawing" xmlns:wp="http://schemas.openxmlformats.org/drawingml/2006/wordprocessingDrawing" xmlns:wpc="http://schemas.microsoft.com/office/word/2010/wordprocessingCanvas" xmlns:wpg="http://schemas.microsoft.com/office/word/2010/wordprocessingGroup" xmlns:wpi="http://schemas.microsoft.com/office/word/2010/wordprocessingInk" xmlns:wps="http://schemas.microsoft.com/office/word/2010/wordprocessingShape" mc:Ignorable="w14 wp14">
+  <w:p>
+    <w:pPr>
+      <w:pStyle w:val="Header"/>
+    </w:pPr>
+    <w:r>
+      <w:rPr>
+        <w:sz w:val="16"/>
+      </w:rPr>
+      <w:t>DELPHI WEB STUDIO  |  COMPLETE WORKFLOW</w:t>
+    </w:r>
+  </w:p>
+</w:hdr>
 </file>
 
 <file path=word/numbering.xml><?xml version="1.0" encoding="utf-8"?>
@@ -1617,7 +2436,7 @@
     <w:qFormat/>
     <w:rsid w:val="00FC693F"/>
     <w:pPr>
-      <w:spacing w:after="140"/>
+      <w:spacing w:after="140" w:line="269" w:lineRule="auto"/>
     </w:pPr>
     <w:rPr>
       <w:rFonts w:ascii="Calibri" w:hAnsi="Calibri"/>
@@ -1679,15 +2498,15 @@
     <w:pPr>
       <w:keepNext/>
       <w:keepLines/>
-      <w:spacing w:before="480" w:after="0"/>
+      <w:spacing w:before="300" w:after="120"/>
       <w:outlineLvl w:val="0"/>
     </w:pPr>
     <w:rPr>
-      <w:rFonts w:asciiTheme="majorHAnsi" w:eastAsiaTheme="majorEastAsia" w:hAnsiTheme="majorHAnsi" w:cstheme="majorBidi"/>
+      <w:rFonts w:asciiTheme="majorHAnsi" w:eastAsiaTheme="majorEastAsia" w:hAnsiTheme="majorHAnsi" w:cstheme="majorBidi" w:ascii="Calibri" w:hAnsi="Calibri"/>
       <w:b/>
       <w:bCs/>
       <w:color w:val="000000"/>
-      <w:sz w:val="28"/>
+      <w:sz w:val="32"/>
       <w:szCs w:val="28"/>
     </w:rPr>
   </w:style>
@@ -1707,11 +2526,11 @@
       <w:outlineLvl w:val="1"/>
     </w:pPr>
     <w:rPr>
-      <w:rFonts w:asciiTheme="majorHAnsi" w:eastAsiaTheme="majorEastAsia" w:hAnsiTheme="majorHAnsi" w:cstheme="majorBidi"/>
+      <w:rFonts w:asciiTheme="majorHAnsi" w:eastAsiaTheme="majorEastAsia" w:hAnsiTheme="majorHAnsi" w:cstheme="majorBidi" w:ascii="Calibri" w:hAnsi="Calibri"/>
       <w:b/>
       <w:bCs/>
       <w:color w:val="000000"/>
-      <w:sz w:val="26"/>
+      <w:sz w:val="24"/>
       <w:szCs w:val="26"/>
     </w:rPr>
   </w:style>
@@ -1969,11 +2788,11 @@
       <w:contextualSpacing/>
     </w:pPr>
     <w:rPr>
-      <w:rFonts w:asciiTheme="majorHAnsi" w:eastAsiaTheme="majorEastAsia" w:hAnsiTheme="majorHAnsi" w:cstheme="majorBidi"/>
+      <w:rFonts w:asciiTheme="majorHAnsi" w:eastAsiaTheme="majorEastAsia" w:hAnsiTheme="majorHAnsi" w:cstheme="majorBidi" w:ascii="Calibri" w:hAnsi="Calibri"/>
       <w:color w:val="000000"/>
       <w:spacing w:val="5"/>
       <w:kern w:val="28"/>
-      <w:sz w:val="52"/>
+      <w:sz w:val="54"/>
       <w:szCs w:val="52"/>
     </w:rPr>
   </w:style>

</xml_diff>